<commit_message>
Expiry & Low Stock: search again (box and per-column filters); days of stock left per item by average sales, most critical first; guides and acceptance tests updated
Co-Authored-By: Claude Sonnet 5.5 <noreply@anthropic.com>
Claude-Session: https://claude.ai/code/session_01611rAAsm4xgneCTG3N9mPf
</commit_message>
<xml_diff>
--- a/docs/acceptance-test/per-user/02-head.auditor.docx
+++ b/docs/acceptance-test/per-user/02-head.auditor.docx
@@ -117,7 +117,7 @@
           <w:sz w:val="18"/>
           <w:szCs w:val="18"/>
         </w:rPr>
-        <w:t xml:space="preserve">  ·  27 checks</w:t>
+        <w:t xml:space="preserve">  ·  28 checks</w:t>
       </w:r>
     </w:p>
     <w:tbl>
@@ -7873,6 +7873,273 @@
                 <w:szCs w:val="19"/>
               </w:rPr>
               <w:t xml:space="preserve">All agents' outlets, itineraries and photos are visible; you cannot approve or change them.</w:t>
+            </w:r>
+          </w:p>
+        </w:tc>
+        <w:tc>
+          <w:tcPr>
+            <w:tcW w:type="dxa" w:w="620"/>
+            <w:tcBorders>
+              <w:top w:val="single" w:color="C9D0DC" w:sz="4"/>
+              <w:left w:val="single" w:color="C9D0DC" w:sz="4"/>
+              <w:bottom w:val="single" w:color="C9D0DC" w:sz="4"/>
+              <w:right w:val="single" w:color="C9D0DC" w:sz="4"/>
+            </w:tcBorders>
+            <w:tcMar>
+              <w:top w:type="dxa" w:w="70"/>
+              <w:left w:type="dxa" w:w="100"/>
+              <w:bottom w:type="dxa" w:w="70"/>
+              <w:right w:type="dxa" w:w="100"/>
+            </w:tcMar>
+            <w:vAlign w:val="center"/>
+          </w:tcPr>
+          <w:p>
+            <w:pPr>
+              <w:spacing w:after="0" w:before="0" w:line="264"/>
+              <w:jc w:val="center"/>
+            </w:pPr>
+            <w:r>
+              <w:rPr>
+                <w:rFonts w:ascii="Arial" w:cs="Arial" w:eastAsia="Arial" w:hAnsi="Arial"/>
+                <w:sz w:val="30"/>
+                <w:szCs w:val="30"/>
+              </w:rPr>
+              <w:t xml:space="preserve">☐</w:t>
+            </w:r>
+          </w:p>
+        </w:tc>
+        <w:tc>
+          <w:tcPr>
+            <w:tcW w:type="dxa" w:w="620"/>
+            <w:tcBorders>
+              <w:top w:val="single" w:color="C9D0DC" w:sz="4"/>
+              <w:left w:val="single" w:color="C9D0DC" w:sz="4"/>
+              <w:bottom w:val="single" w:color="C9D0DC" w:sz="4"/>
+              <w:right w:val="single" w:color="C9D0DC" w:sz="4"/>
+            </w:tcBorders>
+            <w:tcMar>
+              <w:top w:type="dxa" w:w="70"/>
+              <w:left w:type="dxa" w:w="100"/>
+              <w:bottom w:type="dxa" w:w="70"/>
+              <w:right w:type="dxa" w:w="100"/>
+            </w:tcMar>
+            <w:vAlign w:val="center"/>
+          </w:tcPr>
+          <w:p>
+            <w:pPr>
+              <w:spacing w:after="0" w:before="0" w:line="264"/>
+              <w:jc w:val="center"/>
+            </w:pPr>
+            <w:r>
+              <w:rPr>
+                <w:rFonts w:ascii="Arial" w:cs="Arial" w:eastAsia="Arial" w:hAnsi="Arial"/>
+                <w:sz w:val="30"/>
+                <w:szCs w:val="30"/>
+              </w:rPr>
+              <w:t xml:space="preserve">☐</w:t>
+            </w:r>
+          </w:p>
+        </w:tc>
+        <w:tc>
+          <w:tcPr>
+            <w:tcW w:type="dxa" w:w="620"/>
+            <w:tcBorders>
+              <w:top w:val="single" w:color="C9D0DC" w:sz="4"/>
+              <w:left w:val="single" w:color="C9D0DC" w:sz="4"/>
+              <w:bottom w:val="single" w:color="C9D0DC" w:sz="4"/>
+              <w:right w:val="single" w:color="C9D0DC" w:sz="4"/>
+            </w:tcBorders>
+            <w:tcMar>
+              <w:top w:type="dxa" w:w="70"/>
+              <w:left w:type="dxa" w:w="100"/>
+              <w:bottom w:type="dxa" w:w="70"/>
+              <w:right w:type="dxa" w:w="100"/>
+            </w:tcMar>
+            <w:vAlign w:val="center"/>
+          </w:tcPr>
+          <w:p>
+            <w:pPr>
+              <w:spacing w:after="0" w:before="0" w:line="264"/>
+              <w:jc w:val="center"/>
+            </w:pPr>
+            <w:r>
+              <w:rPr>
+                <w:rFonts w:ascii="Arial" w:cs="Arial" w:eastAsia="Arial" w:hAnsi="Arial"/>
+                <w:sz w:val="30"/>
+                <w:szCs w:val="30"/>
+              </w:rPr>
+              <w:t xml:space="preserve">☐</w:t>
+            </w:r>
+          </w:p>
+        </w:tc>
+        <w:tc>
+          <w:tcPr>
+            <w:tcW w:type="dxa" w:w="2040"/>
+            <w:tcBorders>
+              <w:top w:val="single" w:color="C9D0DC" w:sz="4"/>
+              <w:left w:val="single" w:color="C9D0DC" w:sz="4"/>
+              <w:bottom w:val="single" w:color="C9D0DC" w:sz="4"/>
+              <w:right w:val="single" w:color="C9D0DC" w:sz="4"/>
+            </w:tcBorders>
+            <w:tcMar>
+              <w:top w:type="dxa" w:w="70"/>
+              <w:left w:type="dxa" w:w="100"/>
+              <w:bottom w:type="dxa" w:w="70"/>
+              <w:right w:type="dxa" w:w="100"/>
+            </w:tcMar>
+            <w:vAlign w:val="top"/>
+          </w:tcPr>
+          <w:p>
+            <w:pPr>
+              <w:spacing w:after="0" w:before="0" w:line="264"/>
+            </w:pPr>
+            <w:r>
+              <w:rPr>
+                <w:rFonts w:ascii="Arial" w:cs="Arial" w:eastAsia="Arial" w:hAnsi="Arial"/>
+                <w:sz w:val="19"/>
+                <w:szCs w:val="19"/>
+              </w:rPr>
+              <w:t xml:space="preserve"> </w:t>
+            </w:r>
+          </w:p>
+        </w:tc>
+      </w:tr>
+      <w:tr>
+        <w:trPr>
+          <w:cantSplit/>
+        </w:trPr>
+        <w:tc>
+          <w:tcPr>
+            <w:tcW w:type="dxa" w:w="860"/>
+            <w:tcBorders>
+              <w:top w:val="single" w:color="C9D0DC" w:sz="4"/>
+              <w:left w:val="single" w:color="C9D0DC" w:sz="4"/>
+              <w:bottom w:val="single" w:color="C9D0DC" w:sz="4"/>
+              <w:right w:val="single" w:color="C9D0DC" w:sz="4"/>
+            </w:tcBorders>
+            <w:tcMar>
+              <w:top w:type="dxa" w:w="70"/>
+              <w:left w:type="dxa" w:w="100"/>
+              <w:bottom w:type="dxa" w:w="70"/>
+              <w:right w:type="dxa" w:w="100"/>
+            </w:tcMar>
+            <w:vAlign w:val="top"/>
+          </w:tcPr>
+          <w:p>
+            <w:pPr>
+              <w:spacing w:after="0" w:before="0" w:line="264"/>
+            </w:pPr>
+            <w:r>
+              <w:rPr>
+                <w:rFonts w:ascii="Arial" w:cs="Arial" w:eastAsia="Arial" w:hAnsi="Arial"/>
+                <w:b/>
+                <w:bCs/>
+                <w:color w:val="5B6477"/>
+                <w:sz w:val="16"/>
+                <w:szCs w:val="16"/>
+              </w:rPr>
+              <w:t xml:space="preserve">HA-25</w:t>
+            </w:r>
+          </w:p>
+        </w:tc>
+        <w:tc>
+          <w:tcPr>
+            <w:tcW w:type="dxa" w:w="5480"/>
+            <w:tcBorders>
+              <w:top w:val="single" w:color="C9D0DC" w:sz="4"/>
+              <w:left w:val="single" w:color="C9D0DC" w:sz="4"/>
+              <w:bottom w:val="single" w:color="C9D0DC" w:sz="4"/>
+              <w:right w:val="single" w:color="C9D0DC" w:sz="4"/>
+            </w:tcBorders>
+            <w:tcMar>
+              <w:top w:type="dxa" w:w="70"/>
+              <w:left w:type="dxa" w:w="100"/>
+              <w:bottom w:type="dxa" w:w="70"/>
+              <w:right w:type="dxa" w:w="100"/>
+            </w:tcMar>
+            <w:vAlign w:val="top"/>
+          </w:tcPr>
+          <w:p>
+            <w:pPr>
+              <w:spacing w:after="40" w:before="0" w:line="264"/>
+            </w:pPr>
+            <w:r>
+              <w:rPr>
+                <w:rFonts w:ascii="Arial" w:cs="Arial" w:eastAsia="Arial" w:hAnsi="Arial"/>
+                <w:b/>
+                <w:bCs/>
+                <w:sz w:val="20"/>
+                <w:szCs w:val="20"/>
+              </w:rPr>
+              <w:t xml:space="preserve">Days of stock left</w:t>
+            </w:r>
+          </w:p>
+          <w:p>
+            <w:pPr>
+              <w:spacing w:after="20" w:before="0" w:line="264"/>
+            </w:pPr>
+            <w:r>
+              <w:rPr>
+                <w:rFonts w:ascii="Arial" w:cs="Arial" w:eastAsia="Arial" w:hAnsi="Arial"/>
+                <w:color w:val="5B6477"/>
+                <w:sz w:val="19"/>
+                <w:szCs w:val="19"/>
+              </w:rPr>
+              <w:t xml:space="preserve">1.  </w:t>
+            </w:r>
+            <w:r>
+              <w:rPr>
+                <w:rFonts w:ascii="Arial" w:cs="Arial" w:eastAsia="Arial" w:hAnsi="Arial"/>
+                <w:sz w:val="19"/>
+                <w:szCs w:val="19"/>
+              </w:rPr>
+              <w:t xml:space="preserve">Expiry &amp; Low Stock → the card Days of stock left.</w:t>
+            </w:r>
+          </w:p>
+          <w:p>
+            <w:pPr>
+              <w:spacing w:after="20" w:before="0" w:line="264"/>
+            </w:pPr>
+            <w:r>
+              <w:rPr>
+                <w:rFonts w:ascii="Arial" w:cs="Arial" w:eastAsia="Arial" w:hAnsi="Arial"/>
+                <w:color w:val="5B6477"/>
+                <w:sz w:val="19"/>
+                <w:szCs w:val="19"/>
+              </w:rPr>
+              <w:t xml:space="preserve">2.  </w:t>
+            </w:r>
+            <w:r>
+              <w:rPr>
+                <w:rFonts w:ascii="Arial" w:cs="Arial" w:eastAsia="Arial" w:hAnsi="Arial"/>
+                <w:sz w:val="19"/>
+                <w:szCs w:val="19"/>
+              </w:rPr>
+              <w:t xml:space="preserve">Change the average to 60 days; tick All locations together; type in a column filter (for example Level).</w:t>
+            </w:r>
+          </w:p>
+          <w:p>
+            <w:pPr>
+              <w:spacing w:after="0" w:before="60" w:line="264"/>
+            </w:pPr>
+            <w:r>
+              <w:rPr>
+                <w:rFonts w:ascii="Arial" w:cs="Arial" w:eastAsia="Arial" w:hAnsi="Arial"/>
+                <w:b/>
+                <w:bCs/>
+                <w:color w:val="0B1F3A"/>
+                <w:sz w:val="19"/>
+                <w:szCs w:val="19"/>
+              </w:rPr>
+              <w:t xml:space="preserve">You should see: </w:t>
+            </w:r>
+            <w:r>
+              <w:rPr>
+                <w:rFonts w:ascii="Arial" w:cs="Arial" w:eastAsia="Arial" w:hAnsi="Arial"/>
+                <w:sz w:val="19"/>
+                <w:szCs w:val="19"/>
+              </w:rPr>
+              <w:t xml:space="preserve">Items are listed with the most critical first (Out, then fewest days left, no-sales last), with the average per day, the date it runs out and the suggested restock. The filters narrow the rows.</w:t>
             </w:r>
           </w:p>
         </w:tc>
@@ -8076,7 +8343,7 @@
                 <w:sz w:val="17"/>
                 <w:szCs w:val="17"/>
               </w:rPr>
-              <w:t xml:space="preserve">Passed (of 27)</w:t>
+              <w:t xml:space="preserve">Passed (of 28)</w:t>
             </w:r>
           </w:p>
         </w:tc>

</xml_diff>

<commit_message>
Acceptance test Word files for the replacement payment cases
Co-Authored-By: Claude Sonnet 5.5 <noreply@anthropic.com>
Claude-Session: https://claude.ai/code/session_01611rAAsm4xgneCTG3N9mPf
</commit_message>
<xml_diff>
--- a/docs/acceptance-test/per-user/02-head.auditor.docx
+++ b/docs/acceptance-test/per-user/02-head.auditor.docx
@@ -117,7 +117,7 @@
           <w:sz w:val="18"/>
           <w:szCs w:val="18"/>
         </w:rPr>
-        <w:t xml:space="preserve">  ·  30 checks</w:t>
+        <w:t xml:space="preserve">  ·  31 checks</w:t>
       </w:r>
     </w:p>
     <w:tbl>
@@ -8756,6 +8756,289 @@
                 <w:szCs w:val="19"/>
               </w:rPr>
               <w:t xml:space="preserve">A numbered memo and a highlighted PROMO notice go to every branch (franchises get nothing). Cancelling tells everyone and withdraws the memo.</w:t>
+            </w:r>
+          </w:p>
+        </w:tc>
+        <w:tc>
+          <w:tcPr>
+            <w:tcW w:type="dxa" w:w="620"/>
+            <w:tcBorders>
+              <w:top w:val="single" w:color="C9D0DC" w:sz="4"/>
+              <w:left w:val="single" w:color="C9D0DC" w:sz="4"/>
+              <w:bottom w:val="single" w:color="C9D0DC" w:sz="4"/>
+              <w:right w:val="single" w:color="C9D0DC" w:sz="4"/>
+            </w:tcBorders>
+            <w:tcMar>
+              <w:top w:type="dxa" w:w="70"/>
+              <w:left w:type="dxa" w:w="100"/>
+              <w:bottom w:type="dxa" w:w="70"/>
+              <w:right w:type="dxa" w:w="100"/>
+            </w:tcMar>
+            <w:vAlign w:val="center"/>
+          </w:tcPr>
+          <w:p>
+            <w:pPr>
+              <w:spacing w:after="0" w:before="0" w:line="264"/>
+              <w:jc w:val="center"/>
+            </w:pPr>
+            <w:r>
+              <w:rPr>
+                <w:rFonts w:ascii="Arial" w:cs="Arial" w:eastAsia="Arial" w:hAnsi="Arial"/>
+                <w:sz w:val="30"/>
+                <w:szCs w:val="30"/>
+              </w:rPr>
+              <w:t xml:space="preserve">☐</w:t>
+            </w:r>
+          </w:p>
+        </w:tc>
+        <w:tc>
+          <w:tcPr>
+            <w:tcW w:type="dxa" w:w="620"/>
+            <w:tcBorders>
+              <w:top w:val="single" w:color="C9D0DC" w:sz="4"/>
+              <w:left w:val="single" w:color="C9D0DC" w:sz="4"/>
+              <w:bottom w:val="single" w:color="C9D0DC" w:sz="4"/>
+              <w:right w:val="single" w:color="C9D0DC" w:sz="4"/>
+            </w:tcBorders>
+            <w:tcMar>
+              <w:top w:type="dxa" w:w="70"/>
+              <w:left w:type="dxa" w:w="100"/>
+              <w:bottom w:type="dxa" w:w="70"/>
+              <w:right w:type="dxa" w:w="100"/>
+            </w:tcMar>
+            <w:vAlign w:val="center"/>
+          </w:tcPr>
+          <w:p>
+            <w:pPr>
+              <w:spacing w:after="0" w:before="0" w:line="264"/>
+              <w:jc w:val="center"/>
+            </w:pPr>
+            <w:r>
+              <w:rPr>
+                <w:rFonts w:ascii="Arial" w:cs="Arial" w:eastAsia="Arial" w:hAnsi="Arial"/>
+                <w:sz w:val="30"/>
+                <w:szCs w:val="30"/>
+              </w:rPr>
+              <w:t xml:space="preserve">☐</w:t>
+            </w:r>
+          </w:p>
+        </w:tc>
+        <w:tc>
+          <w:tcPr>
+            <w:tcW w:type="dxa" w:w="620"/>
+            <w:tcBorders>
+              <w:top w:val="single" w:color="C9D0DC" w:sz="4"/>
+              <w:left w:val="single" w:color="C9D0DC" w:sz="4"/>
+              <w:bottom w:val="single" w:color="C9D0DC" w:sz="4"/>
+              <w:right w:val="single" w:color="C9D0DC" w:sz="4"/>
+            </w:tcBorders>
+            <w:tcMar>
+              <w:top w:type="dxa" w:w="70"/>
+              <w:left w:type="dxa" w:w="100"/>
+              <w:bottom w:type="dxa" w:w="70"/>
+              <w:right w:type="dxa" w:w="100"/>
+            </w:tcMar>
+            <w:vAlign w:val="center"/>
+          </w:tcPr>
+          <w:p>
+            <w:pPr>
+              <w:spacing w:after="0" w:before="0" w:line="264"/>
+              <w:jc w:val="center"/>
+            </w:pPr>
+            <w:r>
+              <w:rPr>
+                <w:rFonts w:ascii="Arial" w:cs="Arial" w:eastAsia="Arial" w:hAnsi="Arial"/>
+                <w:sz w:val="30"/>
+                <w:szCs w:val="30"/>
+              </w:rPr>
+              <w:t xml:space="preserve">☐</w:t>
+            </w:r>
+          </w:p>
+        </w:tc>
+        <w:tc>
+          <w:tcPr>
+            <w:tcW w:type="dxa" w:w="2040"/>
+            <w:tcBorders>
+              <w:top w:val="single" w:color="C9D0DC" w:sz="4"/>
+              <w:left w:val="single" w:color="C9D0DC" w:sz="4"/>
+              <w:bottom w:val="single" w:color="C9D0DC" w:sz="4"/>
+              <w:right w:val="single" w:color="C9D0DC" w:sz="4"/>
+            </w:tcBorders>
+            <w:tcMar>
+              <w:top w:type="dxa" w:w="70"/>
+              <w:left w:type="dxa" w:w="100"/>
+              <w:bottom w:type="dxa" w:w="70"/>
+              <w:right w:type="dxa" w:w="100"/>
+            </w:tcMar>
+            <w:vAlign w:val="top"/>
+          </w:tcPr>
+          <w:p>
+            <w:pPr>
+              <w:spacing w:after="0" w:before="0" w:line="264"/>
+            </w:pPr>
+            <w:r>
+              <w:rPr>
+                <w:rFonts w:ascii="Arial" w:cs="Arial" w:eastAsia="Arial" w:hAnsi="Arial"/>
+                <w:sz w:val="19"/>
+                <w:szCs w:val="19"/>
+              </w:rPr>
+              <w:t xml:space="preserve"> </w:t>
+            </w:r>
+          </w:p>
+        </w:tc>
+      </w:tr>
+      <w:tr>
+        <w:trPr>
+          <w:cantSplit/>
+        </w:trPr>
+        <w:tc>
+          <w:tcPr>
+            <w:tcW w:type="dxa" w:w="860"/>
+            <w:tcBorders>
+              <w:top w:val="single" w:color="C9D0DC" w:sz="4"/>
+              <w:left w:val="single" w:color="C9D0DC" w:sz="4"/>
+              <w:bottom w:val="single" w:color="C9D0DC" w:sz="4"/>
+              <w:right w:val="single" w:color="C9D0DC" w:sz="4"/>
+            </w:tcBorders>
+            <w:tcMar>
+              <w:top w:type="dxa" w:w="70"/>
+              <w:left w:type="dxa" w:w="100"/>
+              <w:bottom w:type="dxa" w:w="70"/>
+              <w:right w:type="dxa" w:w="100"/>
+            </w:tcMar>
+            <w:vAlign w:val="top"/>
+          </w:tcPr>
+          <w:p>
+            <w:pPr>
+              <w:spacing w:after="0" w:before="0" w:line="264"/>
+            </w:pPr>
+            <w:r>
+              <w:rPr>
+                <w:rFonts w:ascii="Arial" w:cs="Arial" w:eastAsia="Arial" w:hAnsi="Arial"/>
+                <w:b/>
+                <w:bCs/>
+                <w:color w:val="5B6477"/>
+                <w:sz w:val="16"/>
+                <w:szCs w:val="16"/>
+              </w:rPr>
+              <w:t xml:space="preserve">HA-RP</w:t>
+            </w:r>
+          </w:p>
+        </w:tc>
+        <w:tc>
+          <w:tcPr>
+            <w:tcW w:type="dxa" w:w="5480"/>
+            <w:tcBorders>
+              <w:top w:val="single" w:color="C9D0DC" w:sz="4"/>
+              <w:left w:val="single" w:color="C9D0DC" w:sz="4"/>
+              <w:bottom w:val="single" w:color="C9D0DC" w:sz="4"/>
+              <w:right w:val="single" w:color="C9D0DC" w:sz="4"/>
+            </w:tcBorders>
+            <w:tcMar>
+              <w:top w:type="dxa" w:w="70"/>
+              <w:left w:type="dxa" w:w="100"/>
+              <w:bottom w:type="dxa" w:w="70"/>
+              <w:right w:type="dxa" w:w="100"/>
+            </w:tcMar>
+            <w:vAlign w:val="top"/>
+          </w:tcPr>
+          <w:p>
+            <w:pPr>
+              <w:spacing w:after="40" w:before="0" w:line="264"/>
+            </w:pPr>
+            <w:r>
+              <w:rPr>
+                <w:rFonts w:ascii="Arial" w:cs="Arial" w:eastAsia="Arial" w:hAnsi="Arial"/>
+                <w:b/>
+                <w:bCs/>
+                <w:sz w:val="20"/>
+                <w:szCs w:val="20"/>
+              </w:rPr>
+              <w:t xml:space="preserve">Approve a replacement payment on a closed day</w:t>
+            </w:r>
+          </w:p>
+          <w:p>
+            <w:pPr>
+              <w:spacing w:after="40" w:before="0" w:line="264"/>
+            </w:pPr>
+            <w:r>
+              <w:rPr>
+                <w:rFonts w:ascii="Arial" w:cs="Arial" w:eastAsia="Arial" w:hAnsi="Arial"/>
+                <w:i/>
+                <w:iCs/>
+                <w:color w:val="5B6477"/>
+                <w:sz w:val="15"/>
+                <w:szCs w:val="15"/>
+              </w:rPr>
+              <w:t xml:space="preserve">Flow F35 · Replacement payments: how and when the customer settled the difference</w:t>
+            </w:r>
+          </w:p>
+          <w:p>
+            <w:pPr>
+              <w:spacing w:after="20" w:before="0" w:line="264"/>
+            </w:pPr>
+            <w:r>
+              <w:rPr>
+                <w:rFonts w:ascii="Arial" w:cs="Arial" w:eastAsia="Arial" w:hAnsi="Arial"/>
+                <w:color w:val="5B6477"/>
+                <w:sz w:val="19"/>
+                <w:szCs w:val="19"/>
+              </w:rPr>
+              <w:t xml:space="preserve">1.  </w:t>
+            </w:r>
+            <w:r>
+              <w:rPr>
+                <w:rFonts w:ascii="Arial" w:cs="Arial" w:eastAsia="Arial" w:hAnsi="Arial"/>
+                <w:sz w:val="19"/>
+                <w:szCs w:val="19"/>
+              </w:rPr>
+              <w:t xml:space="preserve">My Approvals → Replacement payment dated on a closed day.</w:t>
+            </w:r>
+          </w:p>
+          <w:p>
+            <w:pPr>
+              <w:spacing w:after="20" w:before="0" w:line="264"/>
+            </w:pPr>
+            <w:r>
+              <w:rPr>
+                <w:rFonts w:ascii="Arial" w:cs="Arial" w:eastAsia="Arial" w:hAnsi="Arial"/>
+                <w:color w:val="5B6477"/>
+                <w:sz w:val="19"/>
+                <w:szCs w:val="19"/>
+              </w:rPr>
+              <w:t xml:space="preserve">2.  </w:t>
+            </w:r>
+            <w:r>
+              <w:rPr>
+                <w:rFonts w:ascii="Arial" w:cs="Arial" w:eastAsia="Arial" w:hAnsi="Arial"/>
+                <w:sz w:val="19"/>
+                <w:szCs w:val="19"/>
+              </w:rPr>
+              <w:t xml:space="preserve">Read the ticket, the day, how it was paid and the amount → Approve (or Reject with a reason).</w:t>
+            </w:r>
+          </w:p>
+          <w:p>
+            <w:pPr>
+              <w:spacing w:after="0" w:before="60" w:line="264"/>
+            </w:pPr>
+            <w:r>
+              <w:rPr>
+                <w:rFonts w:ascii="Arial" w:cs="Arial" w:eastAsia="Arial" w:hAnsi="Arial"/>
+                <w:b/>
+                <w:bCs/>
+                <w:color w:val="0B1F3A"/>
+                <w:sz w:val="19"/>
+                <w:szCs w:val="19"/>
+              </w:rPr>
+              <w:t xml:space="preserve">You should see: </w:t>
+            </w:r>
+            <w:r>
+              <w:rPr>
+                <w:rFonts w:ascii="Arial" w:cs="Arial" w:eastAsia="Arial" w:hAnsi="Arial"/>
+                <w:sz w:val="19"/>
+                <w:szCs w:val="19"/>
+              </w:rPr>
+              <w:t xml:space="preserve">Approved: it joins that day's Daily Sales Report and books. Rejected: the branch is told and records it again.</w:t>
             </w:r>
           </w:p>
         </w:tc>
@@ -8959,7 +9242,7 @@
                 <w:sz w:val="17"/>
                 <w:szCs w:val="17"/>
               </w:rPr>
-              <w:t xml:space="preserve">Passed (of 30)</w:t>
+              <w:t xml:space="preserve">Passed (of 31)</w:t>
             </w:r>
           </w:p>
         </w:tc>

</xml_diff>

<commit_message>
Proof of payment: required for online, card and cheque (sales, AR collections, replacement payments, franchise payments) with upload boxes; replacement price difference can be paid in parts with amount, account, reference, proof and day; Daily Sales Report (PDF and Excel) prints every proof with a legend, references beside each sale and a checklist; Payment Proofs report; guides, decisions, simulation steps and acceptance tests updated
Co-Authored-By: Claude Sonnet 5.5 <noreply@anthropic.com>
Claude-Session: https://claude.ai/code/session_01611rAAsm4xgneCTG3N9mPf
</commit_message>
<xml_diff>
--- a/docs/acceptance-test/per-user/02-head.auditor.docx
+++ b/docs/acceptance-test/per-user/02-head.auditor.docx
@@ -117,7 +117,7 @@
           <w:sz w:val="18"/>
           <w:szCs w:val="18"/>
         </w:rPr>
-        <w:t xml:space="preserve">  ·  32 checks</w:t>
+        <w:t xml:space="preserve">  ·  33 checks</w:t>
       </w:r>
     </w:p>
     <w:tbl>
@@ -9388,6 +9388,311 @@
                 <w:szCs w:val="19"/>
               </w:rPr>
               <w:t xml:space="preserve">One order per supplier. The supplier copy shows items and quantities only, no branches. After the Owner approves you are told, and the branches are told to create their pull-outs.</w:t>
+            </w:r>
+          </w:p>
+        </w:tc>
+        <w:tc>
+          <w:tcPr>
+            <w:tcW w:type="dxa" w:w="620"/>
+            <w:tcBorders>
+              <w:top w:val="single" w:color="C9D0DC" w:sz="4"/>
+              <w:left w:val="single" w:color="C9D0DC" w:sz="4"/>
+              <w:bottom w:val="single" w:color="C9D0DC" w:sz="4"/>
+              <w:right w:val="single" w:color="C9D0DC" w:sz="4"/>
+            </w:tcBorders>
+            <w:tcMar>
+              <w:top w:type="dxa" w:w="70"/>
+              <w:left w:type="dxa" w:w="100"/>
+              <w:bottom w:type="dxa" w:w="70"/>
+              <w:right w:type="dxa" w:w="100"/>
+            </w:tcMar>
+            <w:vAlign w:val="center"/>
+          </w:tcPr>
+          <w:p>
+            <w:pPr>
+              <w:spacing w:after="0" w:before="0" w:line="264"/>
+              <w:jc w:val="center"/>
+            </w:pPr>
+            <w:r>
+              <w:rPr>
+                <w:rFonts w:ascii="Arial" w:cs="Arial" w:eastAsia="Arial" w:hAnsi="Arial"/>
+                <w:sz w:val="30"/>
+                <w:szCs w:val="30"/>
+              </w:rPr>
+              <w:t xml:space="preserve">☐</w:t>
+            </w:r>
+          </w:p>
+        </w:tc>
+        <w:tc>
+          <w:tcPr>
+            <w:tcW w:type="dxa" w:w="620"/>
+            <w:tcBorders>
+              <w:top w:val="single" w:color="C9D0DC" w:sz="4"/>
+              <w:left w:val="single" w:color="C9D0DC" w:sz="4"/>
+              <w:bottom w:val="single" w:color="C9D0DC" w:sz="4"/>
+              <w:right w:val="single" w:color="C9D0DC" w:sz="4"/>
+            </w:tcBorders>
+            <w:tcMar>
+              <w:top w:type="dxa" w:w="70"/>
+              <w:left w:type="dxa" w:w="100"/>
+              <w:bottom w:type="dxa" w:w="70"/>
+              <w:right w:type="dxa" w:w="100"/>
+            </w:tcMar>
+            <w:vAlign w:val="center"/>
+          </w:tcPr>
+          <w:p>
+            <w:pPr>
+              <w:spacing w:after="0" w:before="0" w:line="264"/>
+              <w:jc w:val="center"/>
+            </w:pPr>
+            <w:r>
+              <w:rPr>
+                <w:rFonts w:ascii="Arial" w:cs="Arial" w:eastAsia="Arial" w:hAnsi="Arial"/>
+                <w:sz w:val="30"/>
+                <w:szCs w:val="30"/>
+              </w:rPr>
+              <w:t xml:space="preserve">☐</w:t>
+            </w:r>
+          </w:p>
+        </w:tc>
+        <w:tc>
+          <w:tcPr>
+            <w:tcW w:type="dxa" w:w="620"/>
+            <w:tcBorders>
+              <w:top w:val="single" w:color="C9D0DC" w:sz="4"/>
+              <w:left w:val="single" w:color="C9D0DC" w:sz="4"/>
+              <w:bottom w:val="single" w:color="C9D0DC" w:sz="4"/>
+              <w:right w:val="single" w:color="C9D0DC" w:sz="4"/>
+            </w:tcBorders>
+            <w:tcMar>
+              <w:top w:type="dxa" w:w="70"/>
+              <w:left w:type="dxa" w:w="100"/>
+              <w:bottom w:type="dxa" w:w="70"/>
+              <w:right w:type="dxa" w:w="100"/>
+            </w:tcMar>
+            <w:vAlign w:val="center"/>
+          </w:tcPr>
+          <w:p>
+            <w:pPr>
+              <w:spacing w:after="0" w:before="0" w:line="264"/>
+              <w:jc w:val="center"/>
+            </w:pPr>
+            <w:r>
+              <w:rPr>
+                <w:rFonts w:ascii="Arial" w:cs="Arial" w:eastAsia="Arial" w:hAnsi="Arial"/>
+                <w:sz w:val="30"/>
+                <w:szCs w:val="30"/>
+              </w:rPr>
+              <w:t xml:space="preserve">☐</w:t>
+            </w:r>
+          </w:p>
+        </w:tc>
+        <w:tc>
+          <w:tcPr>
+            <w:tcW w:type="dxa" w:w="2040"/>
+            <w:tcBorders>
+              <w:top w:val="single" w:color="C9D0DC" w:sz="4"/>
+              <w:left w:val="single" w:color="C9D0DC" w:sz="4"/>
+              <w:bottom w:val="single" w:color="C9D0DC" w:sz="4"/>
+              <w:right w:val="single" w:color="C9D0DC" w:sz="4"/>
+            </w:tcBorders>
+            <w:tcMar>
+              <w:top w:type="dxa" w:w="70"/>
+              <w:left w:type="dxa" w:w="100"/>
+              <w:bottom w:type="dxa" w:w="70"/>
+              <w:right w:type="dxa" w:w="100"/>
+            </w:tcMar>
+            <w:vAlign w:val="top"/>
+          </w:tcPr>
+          <w:p>
+            <w:pPr>
+              <w:spacing w:after="0" w:before="0" w:line="264"/>
+            </w:pPr>
+            <w:r>
+              <w:rPr>
+                <w:rFonts w:ascii="Arial" w:cs="Arial" w:eastAsia="Arial" w:hAnsi="Arial"/>
+                <w:sz w:val="19"/>
+                <w:szCs w:val="19"/>
+              </w:rPr>
+              <w:t xml:space="preserve"> </w:t>
+            </w:r>
+          </w:p>
+        </w:tc>
+      </w:tr>
+      <w:tr>
+        <w:trPr>
+          <w:cantSplit/>
+        </w:trPr>
+        <w:tc>
+          <w:tcPr>
+            <w:tcW w:type="dxa" w:w="860"/>
+            <w:tcBorders>
+              <w:top w:val="single" w:color="C9D0DC" w:sz="4"/>
+              <w:left w:val="single" w:color="C9D0DC" w:sz="4"/>
+              <w:bottom w:val="single" w:color="C9D0DC" w:sz="4"/>
+              <w:right w:val="single" w:color="C9D0DC" w:sz="4"/>
+            </w:tcBorders>
+            <w:tcMar>
+              <w:top w:type="dxa" w:w="70"/>
+              <w:left w:type="dxa" w:w="100"/>
+              <w:bottom w:type="dxa" w:w="70"/>
+              <w:right w:type="dxa" w:w="100"/>
+            </w:tcMar>
+            <w:vAlign w:val="top"/>
+          </w:tcPr>
+          <w:p>
+            <w:pPr>
+              <w:spacing w:after="0" w:before="0" w:line="264"/>
+            </w:pPr>
+            <w:r>
+              <w:rPr>
+                <w:rFonts w:ascii="Arial" w:cs="Arial" w:eastAsia="Arial" w:hAnsi="Arial"/>
+                <w:b/>
+                <w:bCs/>
+                <w:color w:val="5B6477"/>
+                <w:sz w:val="16"/>
+                <w:szCs w:val="16"/>
+              </w:rPr>
+              <w:t xml:space="preserve">HA-PF</w:t>
+            </w:r>
+          </w:p>
+        </w:tc>
+        <w:tc>
+          <w:tcPr>
+            <w:tcW w:type="dxa" w:w="5480"/>
+            <w:tcBorders>
+              <w:top w:val="single" w:color="C9D0DC" w:sz="4"/>
+              <w:left w:val="single" w:color="C9D0DC" w:sz="4"/>
+              <w:bottom w:val="single" w:color="C9D0DC" w:sz="4"/>
+              <w:right w:val="single" w:color="C9D0DC" w:sz="4"/>
+            </w:tcBorders>
+            <w:tcMar>
+              <w:top w:type="dxa" w:w="70"/>
+              <w:left w:type="dxa" w:w="100"/>
+              <w:bottom w:type="dxa" w:w="70"/>
+              <w:right w:type="dxa" w:w="100"/>
+            </w:tcMar>
+            <w:vAlign w:val="top"/>
+          </w:tcPr>
+          <w:p>
+            <w:pPr>
+              <w:spacing w:after="40" w:before="0" w:line="264"/>
+            </w:pPr>
+            <w:r>
+              <w:rPr>
+                <w:rFonts w:ascii="Arial" w:cs="Arial" w:eastAsia="Arial" w:hAnsi="Arial"/>
+                <w:b/>
+                <w:bCs/>
+                <w:sz w:val="20"/>
+                <w:szCs w:val="20"/>
+              </w:rPr>
+              <w:t xml:space="preserve">Check the proofs of a day from the report</w:t>
+            </w:r>
+          </w:p>
+          <w:p>
+            <w:pPr>
+              <w:spacing w:after="40" w:before="0" w:line="264"/>
+            </w:pPr>
+            <w:r>
+              <w:rPr>
+                <w:rFonts w:ascii="Arial" w:cs="Arial" w:eastAsia="Arial" w:hAnsi="Arial"/>
+                <w:i/>
+                <w:iCs/>
+                <w:color w:val="5B6477"/>
+                <w:sz w:val="15"/>
+                <w:szCs w:val="15"/>
+              </w:rPr>
+              <w:t xml:space="preserve">Flow F37 · Proof of payment: uploaded once, printed with the report</w:t>
+            </w:r>
+          </w:p>
+          <w:p>
+            <w:pPr>
+              <w:spacing w:after="20" w:before="0" w:line="264"/>
+            </w:pPr>
+            <w:r>
+              <w:rPr>
+                <w:rFonts w:ascii="Arial" w:cs="Arial" w:eastAsia="Arial" w:hAnsi="Arial"/>
+                <w:color w:val="5B6477"/>
+                <w:sz w:val="19"/>
+                <w:szCs w:val="19"/>
+              </w:rPr>
+              <w:t xml:space="preserve">1.  </w:t>
+            </w:r>
+            <w:r>
+              <w:rPr>
+                <w:rFonts w:ascii="Arial" w:cs="Arial" w:eastAsia="Arial" w:hAnsi="Arial"/>
+                <w:sz w:val="19"/>
+                <w:szCs w:val="19"/>
+              </w:rPr>
+              <w:t xml:space="preserve">Reports → Daily Sales Report → PDF (or Excel) of a branch and day.</w:t>
+            </w:r>
+          </w:p>
+          <w:p>
+            <w:pPr>
+              <w:spacing w:after="20" w:before="0" w:line="264"/>
+            </w:pPr>
+            <w:r>
+              <w:rPr>
+                <w:rFonts w:ascii="Arial" w:cs="Arial" w:eastAsia="Arial" w:hAnsi="Arial"/>
+                <w:color w:val="5B6477"/>
+                <w:sz w:val="19"/>
+                <w:szCs w:val="19"/>
+              </w:rPr>
+              <w:t xml:space="preserve">2.  </w:t>
+            </w:r>
+            <w:r>
+              <w:rPr>
+                <w:rFonts w:ascii="Arial" w:cs="Arial" w:eastAsia="Arial" w:hAnsi="Arial"/>
+                <w:sz w:val="19"/>
+                <w:szCs w:val="19"/>
+              </w:rPr>
+              <w:t xml:space="preserve">At the end read the legend, the checklist and the pictures; find a sale's reference (for example ON-1) in its Proof column.</w:t>
+            </w:r>
+          </w:p>
+          <w:p>
+            <w:pPr>
+              <w:spacing w:after="20" w:before="0" w:line="264"/>
+            </w:pPr>
+            <w:r>
+              <w:rPr>
+                <w:rFonts w:ascii="Arial" w:cs="Arial" w:eastAsia="Arial" w:hAnsi="Arial"/>
+                <w:color w:val="5B6477"/>
+                <w:sz w:val="19"/>
+                <w:szCs w:val="19"/>
+              </w:rPr>
+              <w:t xml:space="preserve">3.  </w:t>
+            </w:r>
+            <w:r>
+              <w:rPr>
+                <w:rFonts w:ascii="Arial" w:cs="Arial" w:eastAsia="Arial" w:hAnsi="Arial"/>
+                <w:sz w:val="19"/>
+                <w:szCs w:val="19"/>
+              </w:rPr>
+              <w:t xml:space="preserve">Reports → Payment Proofs → choose the branch and dates → Only missing proofs → Print with the pictures (PDF).</w:t>
+            </w:r>
+          </w:p>
+          <w:p>
+            <w:pPr>
+              <w:spacing w:after="0" w:before="60" w:line="264"/>
+            </w:pPr>
+            <w:r>
+              <w:rPr>
+                <w:rFonts w:ascii="Arial" w:cs="Arial" w:eastAsia="Arial" w:hAnsi="Arial"/>
+                <w:b/>
+                <w:bCs/>
+                <w:color w:val="0B1F3A"/>
+                <w:sz w:val="19"/>
+                <w:szCs w:val="19"/>
+              </w:rPr>
+              <w:t xml:space="preserve">You should see: </w:t>
+            </w:r>
+            <w:r>
+              <w:rPr>
+                <w:rFonts w:ascii="Arial" w:cs="Arial" w:eastAsia="Arial" w:hAnsi="Arial"/>
+                <w:sz w:val="19"/>
+                <w:szCs w:val="19"/>
+              </w:rPr>
+              <w:t xml:space="preserve">Every online, card, cheque, collection, replacement payment and deposit slip shows its picture beside the right reference; anything without a proof is red and marked MISSING.</w:t>
             </w:r>
           </w:p>
         </w:tc>
@@ -9591,7 +9896,7 @@
                 <w:sz w:val="17"/>
                 <w:szCs w:val="17"/>
               </w:rPr>
-              <w:t xml:space="preserve">Passed (of 32)</w:t>
+              <w:t xml:space="preserve">Passed (of 33)</w:t>
             </w:r>
           </w:p>
         </w:tc>

</xml_diff>

<commit_message>
Warehouse staff can pay expenses from the warehouse cash fund (spend and see balance only); restock request can be made even when the data says no need (all items of the supplier or a blank order, items added by hand get a row per branch); guides, decisions, simulation steps and acceptance tests updated; member birthday test no longer depends on the 15th
Co-Authored-By: Claude Sonnet 5.5 <noreply@anthropic.com>
Claude-Session: https://claude.ai/code/session_01611rAAsm4xgneCTG3N9mPf
</commit_message>
<xml_diff>
--- a/docs/acceptance-test/per-user/02-head.auditor.docx
+++ b/docs/acceptance-test/per-user/02-head.auditor.docx
@@ -117,7 +117,7 @@
           <w:sz w:val="18"/>
           <w:szCs w:val="18"/>
         </w:rPr>
-        <w:t xml:space="preserve">  ·  33 checks</w:t>
+        <w:t xml:space="preserve">  ·  34 checks</w:t>
       </w:r>
     </w:p>
     <w:tbl>
@@ -9693,6 +9693,311 @@
                 <w:szCs w:val="19"/>
               </w:rPr>
               <w:t xml:space="preserve">Every online, card, cheque, collection, replacement payment and deposit slip shows its picture beside the right reference; anything without a proof is red and marked MISSING.</w:t>
+            </w:r>
+          </w:p>
+        </w:tc>
+        <w:tc>
+          <w:tcPr>
+            <w:tcW w:type="dxa" w:w="620"/>
+            <w:tcBorders>
+              <w:top w:val="single" w:color="C9D0DC" w:sz="4"/>
+              <w:left w:val="single" w:color="C9D0DC" w:sz="4"/>
+              <w:bottom w:val="single" w:color="C9D0DC" w:sz="4"/>
+              <w:right w:val="single" w:color="C9D0DC" w:sz="4"/>
+            </w:tcBorders>
+            <w:tcMar>
+              <w:top w:type="dxa" w:w="70"/>
+              <w:left w:type="dxa" w:w="100"/>
+              <w:bottom w:type="dxa" w:w="70"/>
+              <w:right w:type="dxa" w:w="100"/>
+            </w:tcMar>
+            <w:vAlign w:val="center"/>
+          </w:tcPr>
+          <w:p>
+            <w:pPr>
+              <w:spacing w:after="0" w:before="0" w:line="264"/>
+              <w:jc w:val="center"/>
+            </w:pPr>
+            <w:r>
+              <w:rPr>
+                <w:rFonts w:ascii="Arial" w:cs="Arial" w:eastAsia="Arial" w:hAnsi="Arial"/>
+                <w:sz w:val="30"/>
+                <w:szCs w:val="30"/>
+              </w:rPr>
+              <w:t xml:space="preserve">☐</w:t>
+            </w:r>
+          </w:p>
+        </w:tc>
+        <w:tc>
+          <w:tcPr>
+            <w:tcW w:type="dxa" w:w="620"/>
+            <w:tcBorders>
+              <w:top w:val="single" w:color="C9D0DC" w:sz="4"/>
+              <w:left w:val="single" w:color="C9D0DC" w:sz="4"/>
+              <w:bottom w:val="single" w:color="C9D0DC" w:sz="4"/>
+              <w:right w:val="single" w:color="C9D0DC" w:sz="4"/>
+            </w:tcBorders>
+            <w:tcMar>
+              <w:top w:type="dxa" w:w="70"/>
+              <w:left w:type="dxa" w:w="100"/>
+              <w:bottom w:type="dxa" w:w="70"/>
+              <w:right w:type="dxa" w:w="100"/>
+            </w:tcMar>
+            <w:vAlign w:val="center"/>
+          </w:tcPr>
+          <w:p>
+            <w:pPr>
+              <w:spacing w:after="0" w:before="0" w:line="264"/>
+              <w:jc w:val="center"/>
+            </w:pPr>
+            <w:r>
+              <w:rPr>
+                <w:rFonts w:ascii="Arial" w:cs="Arial" w:eastAsia="Arial" w:hAnsi="Arial"/>
+                <w:sz w:val="30"/>
+                <w:szCs w:val="30"/>
+              </w:rPr>
+              <w:t xml:space="preserve">☐</w:t>
+            </w:r>
+          </w:p>
+        </w:tc>
+        <w:tc>
+          <w:tcPr>
+            <w:tcW w:type="dxa" w:w="620"/>
+            <w:tcBorders>
+              <w:top w:val="single" w:color="C9D0DC" w:sz="4"/>
+              <w:left w:val="single" w:color="C9D0DC" w:sz="4"/>
+              <w:bottom w:val="single" w:color="C9D0DC" w:sz="4"/>
+              <w:right w:val="single" w:color="C9D0DC" w:sz="4"/>
+            </w:tcBorders>
+            <w:tcMar>
+              <w:top w:type="dxa" w:w="70"/>
+              <w:left w:type="dxa" w:w="100"/>
+              <w:bottom w:type="dxa" w:w="70"/>
+              <w:right w:type="dxa" w:w="100"/>
+            </w:tcMar>
+            <w:vAlign w:val="center"/>
+          </w:tcPr>
+          <w:p>
+            <w:pPr>
+              <w:spacing w:after="0" w:before="0" w:line="264"/>
+              <w:jc w:val="center"/>
+            </w:pPr>
+            <w:r>
+              <w:rPr>
+                <w:rFonts w:ascii="Arial" w:cs="Arial" w:eastAsia="Arial" w:hAnsi="Arial"/>
+                <w:sz w:val="30"/>
+                <w:szCs w:val="30"/>
+              </w:rPr>
+              <w:t xml:space="preserve">☐</w:t>
+            </w:r>
+          </w:p>
+        </w:tc>
+        <w:tc>
+          <w:tcPr>
+            <w:tcW w:type="dxa" w:w="2040"/>
+            <w:tcBorders>
+              <w:top w:val="single" w:color="C9D0DC" w:sz="4"/>
+              <w:left w:val="single" w:color="C9D0DC" w:sz="4"/>
+              <w:bottom w:val="single" w:color="C9D0DC" w:sz="4"/>
+              <w:right w:val="single" w:color="C9D0DC" w:sz="4"/>
+            </w:tcBorders>
+            <w:tcMar>
+              <w:top w:type="dxa" w:w="70"/>
+              <w:left w:type="dxa" w:w="100"/>
+              <w:bottom w:type="dxa" w:w="70"/>
+              <w:right w:type="dxa" w:w="100"/>
+            </w:tcMar>
+            <w:vAlign w:val="top"/>
+          </w:tcPr>
+          <w:p>
+            <w:pPr>
+              <w:spacing w:after="0" w:before="0" w:line="264"/>
+            </w:pPr>
+            <w:r>
+              <w:rPr>
+                <w:rFonts w:ascii="Arial" w:cs="Arial" w:eastAsia="Arial" w:hAnsi="Arial"/>
+                <w:sz w:val="19"/>
+                <w:szCs w:val="19"/>
+              </w:rPr>
+              <w:t xml:space="preserve"> </w:t>
+            </w:r>
+          </w:p>
+        </w:tc>
+      </w:tr>
+      <w:tr>
+        <w:trPr>
+          <w:cantSplit/>
+        </w:trPr>
+        <w:tc>
+          <w:tcPr>
+            <w:tcW w:type="dxa" w:w="860"/>
+            <w:tcBorders>
+              <w:top w:val="single" w:color="C9D0DC" w:sz="4"/>
+              <w:left w:val="single" w:color="C9D0DC" w:sz="4"/>
+              <w:bottom w:val="single" w:color="C9D0DC" w:sz="4"/>
+              <w:right w:val="single" w:color="C9D0DC" w:sz="4"/>
+            </w:tcBorders>
+            <w:tcMar>
+              <w:top w:type="dxa" w:w="70"/>
+              <w:left w:type="dxa" w:w="100"/>
+              <w:bottom w:type="dxa" w:w="70"/>
+              <w:right w:type="dxa" w:w="100"/>
+            </w:tcMar>
+            <w:vAlign w:val="top"/>
+          </w:tcPr>
+          <w:p>
+            <w:pPr>
+              <w:spacing w:after="0" w:before="0" w:line="264"/>
+            </w:pPr>
+            <w:r>
+              <w:rPr>
+                <w:rFonts w:ascii="Arial" w:cs="Arial" w:eastAsia="Arial" w:hAnsi="Arial"/>
+                <w:b/>
+                <w:bCs/>
+                <w:color w:val="5B6477"/>
+                <w:sz w:val="16"/>
+                <w:szCs w:val="16"/>
+              </w:rPr>
+              <w:t xml:space="preserve">HA-RO</w:t>
+            </w:r>
+          </w:p>
+        </w:tc>
+        <w:tc>
+          <w:tcPr>
+            <w:tcW w:type="dxa" w:w="5480"/>
+            <w:tcBorders>
+              <w:top w:val="single" w:color="C9D0DC" w:sz="4"/>
+              <w:left w:val="single" w:color="C9D0DC" w:sz="4"/>
+              <w:bottom w:val="single" w:color="C9D0DC" w:sz="4"/>
+              <w:right w:val="single" w:color="C9D0DC" w:sz="4"/>
+            </w:tcBorders>
+            <w:tcMar>
+              <w:top w:type="dxa" w:w="70"/>
+              <w:left w:type="dxa" w:w="100"/>
+              <w:bottom w:type="dxa" w:w="70"/>
+              <w:right w:type="dxa" w:w="100"/>
+            </w:tcMar>
+            <w:vAlign w:val="top"/>
+          </w:tcPr>
+          <w:p>
+            <w:pPr>
+              <w:spacing w:after="40" w:before="0" w:line="264"/>
+            </w:pPr>
+            <w:r>
+              <w:rPr>
+                <w:rFonts w:ascii="Arial" w:cs="Arial" w:eastAsia="Arial" w:hAnsi="Arial"/>
+                <w:b/>
+                <w:bCs/>
+                <w:sz w:val="20"/>
+                <w:szCs w:val="20"/>
+              </w:rPr>
+              <w:t xml:space="preserve">Order even when the data says nothing is needed</w:t>
+            </w:r>
+          </w:p>
+          <w:p>
+            <w:pPr>
+              <w:spacing w:after="40" w:before="0" w:line="264"/>
+            </w:pPr>
+            <w:r>
+              <w:rPr>
+                <w:rFonts w:ascii="Arial" w:cs="Arial" w:eastAsia="Arial" w:hAnsi="Arial"/>
+                <w:i/>
+                <w:iCs/>
+                <w:color w:val="5B6477"/>
+                <w:sz w:val="15"/>
+                <w:szCs w:val="15"/>
+              </w:rPr>
+              <w:t xml:space="preserve">Flow F38 · Warehouse cash fund and restock override</w:t>
+            </w:r>
+          </w:p>
+          <w:p>
+            <w:pPr>
+              <w:spacing w:after="20" w:before="0" w:line="264"/>
+            </w:pPr>
+            <w:r>
+              <w:rPr>
+                <w:rFonts w:ascii="Arial" w:cs="Arial" w:eastAsia="Arial" w:hAnsi="Arial"/>
+                <w:color w:val="5B6477"/>
+                <w:sz w:val="19"/>
+                <w:szCs w:val="19"/>
+              </w:rPr>
+              <w:t xml:space="preserve">1.  </w:t>
+            </w:r>
+            <w:r>
+              <w:rPr>
+                <w:rFonts w:ascii="Arial" w:cs="Arial" w:eastAsia="Arial" w:hAnsi="Arial"/>
+                <w:sz w:val="19"/>
+                <w:szCs w:val="19"/>
+              </w:rPr>
+              <w:t xml:space="preserve">Restock &amp; Purchase Orders → Generate a restock request → tick a supplier whose items do not need restocking → Generate.</w:t>
+            </w:r>
+          </w:p>
+          <w:p>
+            <w:pPr>
+              <w:spacing w:after="20" w:before="0" w:line="264"/>
+            </w:pPr>
+            <w:r>
+              <w:rPr>
+                <w:rFonts w:ascii="Arial" w:cs="Arial" w:eastAsia="Arial" w:hAnsi="Arial"/>
+                <w:color w:val="5B6477"/>
+                <w:sz w:val="19"/>
+                <w:szCs w:val="19"/>
+              </w:rPr>
+              <w:t xml:space="preserve">2.  </w:t>
+            </w:r>
+            <w:r>
+              <w:rPr>
+                <w:rFonts w:ascii="Arial" w:cs="Arial" w:eastAsia="Arial" w:hAnsi="Arial"/>
+                <w:sz w:val="19"/>
+                <w:szCs w:val="19"/>
+              </w:rPr>
+              <w:t xml:space="preserve">Read the message, then choose Every item of the supplier (or A blank order).</w:t>
+            </w:r>
+          </w:p>
+          <w:p>
+            <w:pPr>
+              <w:spacing w:after="20" w:before="0" w:line="264"/>
+            </w:pPr>
+            <w:r>
+              <w:rPr>
+                <w:rFonts w:ascii="Arial" w:cs="Arial" w:eastAsia="Arial" w:hAnsi="Arial"/>
+                <w:color w:val="5B6477"/>
+                <w:sz w:val="19"/>
+                <w:szCs w:val="19"/>
+              </w:rPr>
+              <w:t xml:space="preserve">3.  </w:t>
+            </w:r>
+            <w:r>
+              <w:rPr>
+                <w:rFonts w:ascii="Arial" w:cs="Arial" w:eastAsia="Arial" w:hAnsi="Arial"/>
+                <w:sz w:val="19"/>
+                <w:szCs w:val="19"/>
+              </w:rPr>
+              <w:t xml:space="preserve">Type the order quantity and each branch's share; Save; Send to the Owner.</w:t>
+            </w:r>
+          </w:p>
+          <w:p>
+            <w:pPr>
+              <w:spacing w:after="0" w:before="60" w:line="264"/>
+            </w:pPr>
+            <w:r>
+              <w:rPr>
+                <w:rFonts w:ascii="Arial" w:cs="Arial" w:eastAsia="Arial" w:hAnsi="Arial"/>
+                <w:b/>
+                <w:bCs/>
+                <w:color w:val="0B1F3A"/>
+                <w:sz w:val="19"/>
+                <w:szCs w:val="19"/>
+              </w:rPr>
+              <w:t xml:space="preserve">You should see: </w:t>
+            </w:r>
+            <w:r>
+              <w:rPr>
+                <w:rFonts w:ascii="Arial" w:cs="Arial" w:eastAsia="Arial" w:hAnsi="Arial"/>
+                <w:sz w:val="19"/>
+                <w:szCs w:val="19"/>
+              </w:rPr>
+              <w:t xml:space="preserve">The order is made with your quantities even though the data suggested 0. Items added by hand show a row for every branch.</w:t>
             </w:r>
           </w:p>
         </w:tc>
@@ -9896,7 +10201,7 @@
                 <w:sz w:val="17"/>
                 <w:szCs w:val="17"/>
               </w:rPr>
-              <w:t xml:space="preserve">Passed (of 33)</w:t>
+              <w:t xml:space="preserve">Passed (of 34)</w:t>
             </w:r>
           </w:p>
         </w:tc>

</xml_diff>

<commit_message>
Franchise availability and orders (coordinator generates, warehouse edits, franchise orders, picklist, final check, DR); franchise DRs from any branch notify the franchise (confirm receipt, report problem) and the coordinator can correct them; unpaid DR goods show in Franchise AR; branch stock requests appear to the Warehouse In-Charge to edit quantities; promo % (20-70), internal quantity and promo tick on sales; cash fund spending for warehouse; guides, decisions, simulation steps and acceptance tests updated
Co-Authored-By: Claude Sonnet 5.5 <noreply@anthropic.com>
Claude-Session: https://claude.ai/code/session_01611rAAsm4xgneCTG3N9mPf
</commit_message>
<xml_diff>
--- a/docs/acceptance-test/per-user/02-head.auditor.docx
+++ b/docs/acceptance-test/per-user/02-head.auditor.docx
@@ -117,7 +117,7 @@
           <w:sz w:val="18"/>
           <w:szCs w:val="18"/>
         </w:rPr>
-        <w:t xml:space="preserve">  ·  34 checks</w:t>
+        <w:t xml:space="preserve">  ·  35 checks</w:t>
       </w:r>
     </w:p>
     <w:tbl>
@@ -9998,6 +9998,289 @@
                 <w:szCs w:val="19"/>
               </w:rPr>
               <w:t xml:space="preserve">The order is made with your quantities even though the data suggested 0. Items added by hand show a row for every branch.</w:t>
+            </w:r>
+          </w:p>
+        </w:tc>
+        <w:tc>
+          <w:tcPr>
+            <w:tcW w:type="dxa" w:w="620"/>
+            <w:tcBorders>
+              <w:top w:val="single" w:color="C9D0DC" w:sz="4"/>
+              <w:left w:val="single" w:color="C9D0DC" w:sz="4"/>
+              <w:bottom w:val="single" w:color="C9D0DC" w:sz="4"/>
+              <w:right w:val="single" w:color="C9D0DC" w:sz="4"/>
+            </w:tcBorders>
+            <w:tcMar>
+              <w:top w:type="dxa" w:w="70"/>
+              <w:left w:type="dxa" w:w="100"/>
+              <w:bottom w:type="dxa" w:w="70"/>
+              <w:right w:type="dxa" w:w="100"/>
+            </w:tcMar>
+            <w:vAlign w:val="center"/>
+          </w:tcPr>
+          <w:p>
+            <w:pPr>
+              <w:spacing w:after="0" w:before="0" w:line="264"/>
+              <w:jc w:val="center"/>
+            </w:pPr>
+            <w:r>
+              <w:rPr>
+                <w:rFonts w:ascii="Arial" w:cs="Arial" w:eastAsia="Arial" w:hAnsi="Arial"/>
+                <w:sz w:val="30"/>
+                <w:szCs w:val="30"/>
+              </w:rPr>
+              <w:t xml:space="preserve">☐</w:t>
+            </w:r>
+          </w:p>
+        </w:tc>
+        <w:tc>
+          <w:tcPr>
+            <w:tcW w:type="dxa" w:w="620"/>
+            <w:tcBorders>
+              <w:top w:val="single" w:color="C9D0DC" w:sz="4"/>
+              <w:left w:val="single" w:color="C9D0DC" w:sz="4"/>
+              <w:bottom w:val="single" w:color="C9D0DC" w:sz="4"/>
+              <w:right w:val="single" w:color="C9D0DC" w:sz="4"/>
+            </w:tcBorders>
+            <w:tcMar>
+              <w:top w:type="dxa" w:w="70"/>
+              <w:left w:type="dxa" w:w="100"/>
+              <w:bottom w:type="dxa" w:w="70"/>
+              <w:right w:type="dxa" w:w="100"/>
+            </w:tcMar>
+            <w:vAlign w:val="center"/>
+          </w:tcPr>
+          <w:p>
+            <w:pPr>
+              <w:spacing w:after="0" w:before="0" w:line="264"/>
+              <w:jc w:val="center"/>
+            </w:pPr>
+            <w:r>
+              <w:rPr>
+                <w:rFonts w:ascii="Arial" w:cs="Arial" w:eastAsia="Arial" w:hAnsi="Arial"/>
+                <w:sz w:val="30"/>
+                <w:szCs w:val="30"/>
+              </w:rPr>
+              <w:t xml:space="preserve">☐</w:t>
+            </w:r>
+          </w:p>
+        </w:tc>
+        <w:tc>
+          <w:tcPr>
+            <w:tcW w:type="dxa" w:w="620"/>
+            <w:tcBorders>
+              <w:top w:val="single" w:color="C9D0DC" w:sz="4"/>
+              <w:left w:val="single" w:color="C9D0DC" w:sz="4"/>
+              <w:bottom w:val="single" w:color="C9D0DC" w:sz="4"/>
+              <w:right w:val="single" w:color="C9D0DC" w:sz="4"/>
+            </w:tcBorders>
+            <w:tcMar>
+              <w:top w:type="dxa" w:w="70"/>
+              <w:left w:type="dxa" w:w="100"/>
+              <w:bottom w:type="dxa" w:w="70"/>
+              <w:right w:type="dxa" w:w="100"/>
+            </w:tcMar>
+            <w:vAlign w:val="center"/>
+          </w:tcPr>
+          <w:p>
+            <w:pPr>
+              <w:spacing w:after="0" w:before="0" w:line="264"/>
+              <w:jc w:val="center"/>
+            </w:pPr>
+            <w:r>
+              <w:rPr>
+                <w:rFonts w:ascii="Arial" w:cs="Arial" w:eastAsia="Arial" w:hAnsi="Arial"/>
+                <w:sz w:val="30"/>
+                <w:szCs w:val="30"/>
+              </w:rPr>
+              <w:t xml:space="preserve">☐</w:t>
+            </w:r>
+          </w:p>
+        </w:tc>
+        <w:tc>
+          <w:tcPr>
+            <w:tcW w:type="dxa" w:w="2040"/>
+            <w:tcBorders>
+              <w:top w:val="single" w:color="C9D0DC" w:sz="4"/>
+              <w:left w:val="single" w:color="C9D0DC" w:sz="4"/>
+              <w:bottom w:val="single" w:color="C9D0DC" w:sz="4"/>
+              <w:right w:val="single" w:color="C9D0DC" w:sz="4"/>
+            </w:tcBorders>
+            <w:tcMar>
+              <w:top w:type="dxa" w:w="70"/>
+              <w:left w:type="dxa" w:w="100"/>
+              <w:bottom w:type="dxa" w:w="70"/>
+              <w:right w:type="dxa" w:w="100"/>
+            </w:tcMar>
+            <w:vAlign w:val="top"/>
+          </w:tcPr>
+          <w:p>
+            <w:pPr>
+              <w:spacing w:after="0" w:before="0" w:line="264"/>
+            </w:pPr>
+            <w:r>
+              <w:rPr>
+                <w:rFonts w:ascii="Arial" w:cs="Arial" w:eastAsia="Arial" w:hAnsi="Arial"/>
+                <w:sz w:val="19"/>
+                <w:szCs w:val="19"/>
+              </w:rPr>
+              <w:t xml:space="preserve"> </w:t>
+            </w:r>
+          </w:p>
+        </w:tc>
+      </w:tr>
+      <w:tr>
+        <w:trPr>
+          <w:cantSplit/>
+        </w:trPr>
+        <w:tc>
+          <w:tcPr>
+            <w:tcW w:type="dxa" w:w="860"/>
+            <w:tcBorders>
+              <w:top w:val="single" w:color="C9D0DC" w:sz="4"/>
+              <w:left w:val="single" w:color="C9D0DC" w:sz="4"/>
+              <w:bottom w:val="single" w:color="C9D0DC" w:sz="4"/>
+              <w:right w:val="single" w:color="C9D0DC" w:sz="4"/>
+            </w:tcBorders>
+            <w:tcMar>
+              <w:top w:type="dxa" w:w="70"/>
+              <w:left w:type="dxa" w:w="100"/>
+              <w:bottom w:type="dxa" w:w="70"/>
+              <w:right w:type="dxa" w:w="100"/>
+            </w:tcMar>
+            <w:vAlign w:val="top"/>
+          </w:tcPr>
+          <w:p>
+            <w:pPr>
+              <w:spacing w:after="0" w:before="0" w:line="264"/>
+            </w:pPr>
+            <w:r>
+              <w:rPr>
+                <w:rFonts w:ascii="Arial" w:cs="Arial" w:eastAsia="Arial" w:hAnsi="Arial"/>
+                <w:b/>
+                <w:bCs/>
+                <w:color w:val="5B6477"/>
+                <w:sz w:val="16"/>
+                <w:szCs w:val="16"/>
+              </w:rPr>
+              <w:t xml:space="preserve">HA-PP</w:t>
+            </w:r>
+          </w:p>
+        </w:tc>
+        <w:tc>
+          <w:tcPr>
+            <w:tcW w:type="dxa" w:w="5480"/>
+            <w:tcBorders>
+              <w:top w:val="single" w:color="C9D0DC" w:sz="4"/>
+              <w:left w:val="single" w:color="C9D0DC" w:sz="4"/>
+              <w:bottom w:val="single" w:color="C9D0DC" w:sz="4"/>
+              <w:right w:val="single" w:color="C9D0DC" w:sz="4"/>
+            </w:tcBorders>
+            <w:tcMar>
+              <w:top w:type="dxa" w:w="70"/>
+              <w:left w:type="dxa" w:w="100"/>
+              <w:bottom w:type="dxa" w:w="70"/>
+              <w:right w:type="dxa" w:w="100"/>
+            </w:tcMar>
+            <w:vAlign w:val="top"/>
+          </w:tcPr>
+          <w:p>
+            <w:pPr>
+              <w:spacing w:after="40" w:before="0" w:line="264"/>
+            </w:pPr>
+            <w:r>
+              <w:rPr>
+                <w:rFonts w:ascii="Arial" w:cs="Arial" w:eastAsia="Arial" w:hAnsi="Arial"/>
+                <w:b/>
+                <w:bCs/>
+                <w:sz w:val="20"/>
+                <w:szCs w:val="20"/>
+              </w:rPr>
+              <w:t xml:space="preserve">Promo percentage and internal quantity</w:t>
+            </w:r>
+          </w:p>
+          <w:p>
+            <w:pPr>
+              <w:spacing w:after="40" w:before="0" w:line="264"/>
+            </w:pPr>
+            <w:r>
+              <w:rPr>
+                <w:rFonts w:ascii="Arial" w:cs="Arial" w:eastAsia="Arial" w:hAnsi="Arial"/>
+                <w:i/>
+                <w:iCs/>
+                <w:color w:val="5B6477"/>
+                <w:sz w:val="15"/>
+                <w:szCs w:val="15"/>
+              </w:rPr>
+              <w:t xml:space="preserve">Flow F42 · Promo percentage, internal quantity and tick</w:t>
+            </w:r>
+          </w:p>
+          <w:p>
+            <w:pPr>
+              <w:spacing w:after="20" w:before="0" w:line="264"/>
+            </w:pPr>
+            <w:r>
+              <w:rPr>
+                <w:rFonts w:ascii="Arial" w:cs="Arial" w:eastAsia="Arial" w:hAnsi="Arial"/>
+                <w:color w:val="5B6477"/>
+                <w:sz w:val="19"/>
+                <w:szCs w:val="19"/>
+              </w:rPr>
+              <w:t xml:space="preserve">1.  </w:t>
+            </w:r>
+            <w:r>
+              <w:rPr>
+                <w:rFonts w:ascii="Arial" w:cs="Arial" w:eastAsia="Arial" w:hAnsi="Arial"/>
+                <w:sz w:val="19"/>
+                <w:szCs w:val="19"/>
+              </w:rPr>
+              <w:t xml:space="preserve">Promos → Issue a promo → choose 30% off for a product, type the internal quantity → Issue.</w:t>
+            </w:r>
+          </w:p>
+          <w:p>
+            <w:pPr>
+              <w:spacing w:after="20" w:before="0" w:line="264"/>
+            </w:pPr>
+            <w:r>
+              <w:rPr>
+                <w:rFonts w:ascii="Arial" w:cs="Arial" w:eastAsia="Arial" w:hAnsi="Arial"/>
+                <w:color w:val="5B6477"/>
+                <w:sz w:val="19"/>
+                <w:szCs w:val="19"/>
+              </w:rPr>
+              <w:t xml:space="preserve">2.  </w:t>
+            </w:r>
+            <w:r>
+              <w:rPr>
+                <w:rFonts w:ascii="Arial" w:cs="Arial" w:eastAsia="Arial" w:hAnsi="Arial"/>
+                <w:sz w:val="19"/>
+                <w:szCs w:val="19"/>
+              </w:rPr>
+              <w:t xml:space="preserve">Open See promo sales.</w:t>
+            </w:r>
+          </w:p>
+          <w:p>
+            <w:pPr>
+              <w:spacing w:after="0" w:before="60" w:line="264"/>
+            </w:pPr>
+            <w:r>
+              <w:rPr>
+                <w:rFonts w:ascii="Arial" w:cs="Arial" w:eastAsia="Arial" w:hAnsi="Arial"/>
+                <w:b/>
+                <w:bCs/>
+                <w:color w:val="0B1F3A"/>
+                <w:sz w:val="19"/>
+                <w:szCs w:val="19"/>
+              </w:rPr>
+              <w:t xml:space="preserve">You should see: </w:t>
+            </w:r>
+            <w:r>
+              <w:rPr>
+                <w:rFonts w:ascii="Arial" w:cs="Arial" w:eastAsia="Arial" w:hAnsi="Arial"/>
+                <w:sz w:val="19"/>
+                <w:szCs w:val="19"/>
+              </w:rPr>
+              <w:t xml:space="preserve">The promo price is the tier price less 30%. The internal quantity is not on the branch memo; sold and left are shown.</w:t>
             </w:r>
           </w:p>
         </w:tc>
@@ -10201,7 +10484,7 @@
                 <w:sz w:val="17"/>
                 <w:szCs w:val="17"/>
               </w:rPr>
-              <w:t xml:space="preserve">Passed (of 34)</w:t>
+              <w:t xml:space="preserve">Passed (of 35)</w:t>
             </w:r>
           </w:p>
         </w:tc>

</xml_diff>

<commit_message>
Acceptance test checklists and user guide rebuilt for the warehouse cash funds, dashboard search and stock layout
Co-Authored-By: Claude Sonnet 5.5 <noreply@anthropic.com>
Claude-Session: https://claude.ai/code/session_01611rAAsm4xgneCTG3N9mPf
</commit_message>
<xml_diff>
--- a/docs/acceptance-test/per-user/02-head.auditor.docx
+++ b/docs/acceptance-test/per-user/02-head.auditor.docx
@@ -117,7 +117,7 @@
           <w:sz w:val="18"/>
           <w:szCs w:val="18"/>
         </w:rPr>
-        <w:t xml:space="preserve">  ·  35 checks</w:t>
+        <w:t xml:space="preserve">  ·  36 checks</w:t>
       </w:r>
     </w:p>
     <w:tbl>
@@ -1620,6 +1620,273 @@
                 <w:szCs w:val="19"/>
               </w:rPr>
               <w:t xml:space="preserve">The QR card shows; after a tagged sale the purchase appears with its items. Sign out and in again with the mobile number and password.</w:t>
+            </w:r>
+          </w:p>
+        </w:tc>
+        <w:tc>
+          <w:tcPr>
+            <w:tcW w:type="dxa" w:w="620"/>
+            <w:tcBorders>
+              <w:top w:val="single" w:color="C9D0DC" w:sz="4"/>
+              <w:left w:val="single" w:color="C9D0DC" w:sz="4"/>
+              <w:bottom w:val="single" w:color="C9D0DC" w:sz="4"/>
+              <w:right w:val="single" w:color="C9D0DC" w:sz="4"/>
+            </w:tcBorders>
+            <w:tcMar>
+              <w:top w:type="dxa" w:w="70"/>
+              <w:left w:type="dxa" w:w="100"/>
+              <w:bottom w:type="dxa" w:w="70"/>
+              <w:right w:type="dxa" w:w="100"/>
+            </w:tcMar>
+            <w:vAlign w:val="center"/>
+          </w:tcPr>
+          <w:p>
+            <w:pPr>
+              <w:spacing w:after="0" w:before="0" w:line="264"/>
+              <w:jc w:val="center"/>
+            </w:pPr>
+            <w:r>
+              <w:rPr>
+                <w:rFonts w:ascii="Arial" w:cs="Arial" w:eastAsia="Arial" w:hAnsi="Arial"/>
+                <w:sz w:val="30"/>
+                <w:szCs w:val="30"/>
+              </w:rPr>
+              <w:t xml:space="preserve">☐</w:t>
+            </w:r>
+          </w:p>
+        </w:tc>
+        <w:tc>
+          <w:tcPr>
+            <w:tcW w:type="dxa" w:w="620"/>
+            <w:tcBorders>
+              <w:top w:val="single" w:color="C9D0DC" w:sz="4"/>
+              <w:left w:val="single" w:color="C9D0DC" w:sz="4"/>
+              <w:bottom w:val="single" w:color="C9D0DC" w:sz="4"/>
+              <w:right w:val="single" w:color="C9D0DC" w:sz="4"/>
+            </w:tcBorders>
+            <w:tcMar>
+              <w:top w:type="dxa" w:w="70"/>
+              <w:left w:type="dxa" w:w="100"/>
+              <w:bottom w:type="dxa" w:w="70"/>
+              <w:right w:type="dxa" w:w="100"/>
+            </w:tcMar>
+            <w:vAlign w:val="center"/>
+          </w:tcPr>
+          <w:p>
+            <w:pPr>
+              <w:spacing w:after="0" w:before="0" w:line="264"/>
+              <w:jc w:val="center"/>
+            </w:pPr>
+            <w:r>
+              <w:rPr>
+                <w:rFonts w:ascii="Arial" w:cs="Arial" w:eastAsia="Arial" w:hAnsi="Arial"/>
+                <w:sz w:val="30"/>
+                <w:szCs w:val="30"/>
+              </w:rPr>
+              <w:t xml:space="preserve">☐</w:t>
+            </w:r>
+          </w:p>
+        </w:tc>
+        <w:tc>
+          <w:tcPr>
+            <w:tcW w:type="dxa" w:w="620"/>
+            <w:tcBorders>
+              <w:top w:val="single" w:color="C9D0DC" w:sz="4"/>
+              <w:left w:val="single" w:color="C9D0DC" w:sz="4"/>
+              <w:bottom w:val="single" w:color="C9D0DC" w:sz="4"/>
+              <w:right w:val="single" w:color="C9D0DC" w:sz="4"/>
+            </w:tcBorders>
+            <w:tcMar>
+              <w:top w:type="dxa" w:w="70"/>
+              <w:left w:type="dxa" w:w="100"/>
+              <w:bottom w:type="dxa" w:w="70"/>
+              <w:right w:type="dxa" w:w="100"/>
+            </w:tcMar>
+            <w:vAlign w:val="center"/>
+          </w:tcPr>
+          <w:p>
+            <w:pPr>
+              <w:spacing w:after="0" w:before="0" w:line="264"/>
+              <w:jc w:val="center"/>
+            </w:pPr>
+            <w:r>
+              <w:rPr>
+                <w:rFonts w:ascii="Arial" w:cs="Arial" w:eastAsia="Arial" w:hAnsi="Arial"/>
+                <w:sz w:val="30"/>
+                <w:szCs w:val="30"/>
+              </w:rPr>
+              <w:t xml:space="preserve">☐</w:t>
+            </w:r>
+          </w:p>
+        </w:tc>
+        <w:tc>
+          <w:tcPr>
+            <w:tcW w:type="dxa" w:w="2040"/>
+            <w:tcBorders>
+              <w:top w:val="single" w:color="C9D0DC" w:sz="4"/>
+              <w:left w:val="single" w:color="C9D0DC" w:sz="4"/>
+              <w:bottom w:val="single" w:color="C9D0DC" w:sz="4"/>
+              <w:right w:val="single" w:color="C9D0DC" w:sz="4"/>
+            </w:tcBorders>
+            <w:tcMar>
+              <w:top w:type="dxa" w:w="70"/>
+              <w:left w:type="dxa" w:w="100"/>
+              <w:bottom w:type="dxa" w:w="70"/>
+              <w:right w:type="dxa" w:w="100"/>
+            </w:tcMar>
+            <w:vAlign w:val="top"/>
+          </w:tcPr>
+          <w:p>
+            <w:pPr>
+              <w:spacing w:after="0" w:before="0" w:line="264"/>
+            </w:pPr>
+            <w:r>
+              <w:rPr>
+                <w:rFonts w:ascii="Arial" w:cs="Arial" w:eastAsia="Arial" w:hAnsi="Arial"/>
+                <w:sz w:val="19"/>
+                <w:szCs w:val="19"/>
+              </w:rPr>
+              <w:t xml:space="preserve"> </w:t>
+            </w:r>
+          </w:p>
+        </w:tc>
+      </w:tr>
+      <w:tr>
+        <w:trPr>
+          <w:cantSplit/>
+        </w:trPr>
+        <w:tc>
+          <w:tcPr>
+            <w:tcW w:type="dxa" w:w="860"/>
+            <w:tcBorders>
+              <w:top w:val="single" w:color="C9D0DC" w:sz="4"/>
+              <w:left w:val="single" w:color="C9D0DC" w:sz="4"/>
+              <w:bottom w:val="single" w:color="C9D0DC" w:sz="4"/>
+              <w:right w:val="single" w:color="C9D0DC" w:sz="4"/>
+            </w:tcBorders>
+            <w:tcMar>
+              <w:top w:type="dxa" w:w="70"/>
+              <w:left w:type="dxa" w:w="100"/>
+              <w:bottom w:type="dxa" w:w="70"/>
+              <w:right w:type="dxa" w:w="100"/>
+            </w:tcMar>
+            <w:vAlign w:val="top"/>
+          </w:tcPr>
+          <w:p>
+            <w:pPr>
+              <w:spacing w:after="0" w:before="0" w:line="264"/>
+            </w:pPr>
+            <w:r>
+              <w:rPr>
+                <w:rFonts w:ascii="Arial" w:cs="Arial" w:eastAsia="Arial" w:hAnsi="Arial"/>
+                <w:b/>
+                <w:bCs/>
+                <w:color w:val="5B6477"/>
+                <w:sz w:val="16"/>
+                <w:szCs w:val="16"/>
+              </w:rPr>
+              <w:t xml:space="preserve">CM-SRCH</w:t>
+            </w:r>
+          </w:p>
+        </w:tc>
+        <w:tc>
+          <w:tcPr>
+            <w:tcW w:type="dxa" w:w="5480"/>
+            <w:tcBorders>
+              <w:top w:val="single" w:color="C9D0DC" w:sz="4"/>
+              <w:left w:val="single" w:color="C9D0DC" w:sz="4"/>
+              <w:bottom w:val="single" w:color="C9D0DC" w:sz="4"/>
+              <w:right w:val="single" w:color="C9D0DC" w:sz="4"/>
+            </w:tcBorders>
+            <w:tcMar>
+              <w:top w:type="dxa" w:w="70"/>
+              <w:left w:type="dxa" w:w="100"/>
+              <w:bottom w:type="dxa" w:w="70"/>
+              <w:right w:type="dxa" w:w="100"/>
+            </w:tcMar>
+            <w:vAlign w:val="top"/>
+          </w:tcPr>
+          <w:p>
+            <w:pPr>
+              <w:spacing w:after="40" w:before="0" w:line="264"/>
+            </w:pPr>
+            <w:r>
+              <w:rPr>
+                <w:rFonts w:ascii="Arial" w:cs="Arial" w:eastAsia="Arial" w:hAnsi="Arial"/>
+                <w:b/>
+                <w:bCs/>
+                <w:sz w:val="20"/>
+                <w:szCs w:val="20"/>
+              </w:rPr>
+              <w:t xml:space="preserve">Dashboard search and Stock on Hand layout</w:t>
+            </w:r>
+          </w:p>
+          <w:p>
+            <w:pPr>
+              <w:spacing w:after="20" w:before="0" w:line="264"/>
+            </w:pPr>
+            <w:r>
+              <w:rPr>
+                <w:rFonts w:ascii="Arial" w:cs="Arial" w:eastAsia="Arial" w:hAnsi="Arial"/>
+                <w:color w:val="5B6477"/>
+                <w:sz w:val="19"/>
+                <w:szCs w:val="19"/>
+              </w:rPr>
+              <w:t xml:space="preserve">1.  </w:t>
+            </w:r>
+            <w:r>
+              <w:rPr>
+                <w:rFonts w:ascii="Arial" w:cs="Arial" w:eastAsia="Arial" w:hAnsi="Arial"/>
+                <w:sz w:val="19"/>
+                <w:szCs w:val="19"/>
+              </w:rPr>
+              <w:t xml:space="preserve">Dashboard → type part of a screen name in the search box.</w:t>
+            </w:r>
+          </w:p>
+          <w:p>
+            <w:pPr>
+              <w:spacing w:after="20" w:before="0" w:line="264"/>
+            </w:pPr>
+            <w:r>
+              <w:rPr>
+                <w:rFonts w:ascii="Arial" w:cs="Arial" w:eastAsia="Arial" w:hAnsi="Arial"/>
+                <w:color w:val="5B6477"/>
+                <w:sz w:val="19"/>
+                <w:szCs w:val="19"/>
+              </w:rPr>
+              <w:t xml:space="preserve">2.  </w:t>
+            </w:r>
+            <w:r>
+              <w:rPr>
+                <w:rFonts w:ascii="Arial" w:cs="Arial" w:eastAsia="Arial" w:hAnsi="Arial"/>
+                <w:sz w:val="19"/>
+                <w:szCs w:val="19"/>
+              </w:rPr>
+              <w:t xml:space="preserve">Stock on Hand → look at an item with several flavors or expiry dates (if your account sees stock).</w:t>
+            </w:r>
+          </w:p>
+          <w:p>
+            <w:pPr>
+              <w:spacing w:after="0" w:before="60" w:line="264"/>
+            </w:pPr>
+            <w:r>
+              <w:rPr>
+                <w:rFonts w:ascii="Arial" w:cs="Arial" w:eastAsia="Arial" w:hAnsi="Arial"/>
+                <w:b/>
+                <w:bCs/>
+                <w:color w:val="0B1F3A"/>
+                <w:sz w:val="19"/>
+                <w:szCs w:val="19"/>
+              </w:rPr>
+              <w:t xml:space="preserve">You should see: </w:t>
+            </w:r>
+            <w:r>
+              <w:rPr>
+                <w:rFonts w:ascii="Arial" w:cs="Arial" w:eastAsia="Arial" w:hAnsi="Arial"/>
+                <w:sz w:val="19"/>
+                <w:szCs w:val="19"/>
+              </w:rPr>
+              <w:t xml:space="preserve">The matching screens are listed. Flavors and expiry dates are shown as labelled rows with their quantity.</w:t>
             </w:r>
           </w:p>
         </w:tc>
@@ -10484,7 +10751,7 @@
                 <w:sz w:val="17"/>
                 <w:szCs w:val="17"/>
               </w:rPr>
-              <w:t xml:space="preserve">Passed (of 35)</w:t>
+              <w:t xml:space="preserve">Passed (of 36)</w:t>
             </w:r>
           </w:p>
         </w:tc>

</xml_diff>